<commit_message>
Replaced method familes with group or groupings, JI and KS revision requested
</commit_message>
<xml_diff>
--- a/_book/techreport.docx
+++ b/_book/techreport.docx
@@ -67,7 +67,7 @@
                 <w:szCs w:val="36"/>
                 <w:lang w:val="fr-CA"/>
               </w:rPr>
-              <w:t xml:space="preserve">Updated Escapement Estimate Type Classification Guidance</w:t>
+              <w:t xml:space="preserve">Guidance on an Updated Spawner Estimation Classification System</w:t>
             </w:r>
             <w:r>
               <w:rPr>
@@ -259,17 +259,6 @@
                 <w:vertAlign w:val="superscript"/>
               </w:rPr>
               <w:t xml:space="preserve">3</w:t>
-            </w:r>
-            <w:r>
-              <w:rPr>
-                <w:rFonts w:ascii="Microsoft Sans Serif" w:hAnsi="Microsoft Sans Serif" w:cs="Microsoft Sans Serif"/>
-                <w:sz w:val="28"/>
-                <w:szCs w:val="28"/>
-                <w:rFonts w:ascii="Microsoft Sans Serif" w:hAnsi="Microsoft Sans Serif" w:cs="Microsoft Sans Serif"/>
-                <w:sz w:val="28"/>
-                <w:szCs w:val="28"/>
-              </w:rPr>
-              <w:t xml:space="preserve">, Regional Escapement Data Task Team</w:t>
             </w:r>
             <w:r>
               <w:rPr>

</xml_diff>